<commit_message>
Vorlagen auf Katalogfassung 10 neu erzeugt
Katalog v10 bringt Word-Schlüssel, KatalogfassungWord steigt auf 10:
Sammellauf `alle` zweimal gezogen, zweiter Lauf byte-gleich.

- Ausführliche Vorlage (de/en): im Block je Stand die zehn
  Ergebnisbilder je unter hat.bild.<name>, die Kennwerte des
  Speicherlaufs unter stand.hat_speicherlauf und die solare Deckung.
- Bausteinvorlage: die neuen Schlüssel als Schnellbausteine, dazu die
  Beispiele der Positionsform (Word-Fassung ≥ 8).
- Beispiel-, Standard-, Kurzbericht- und Excel-Vorlagen: nur die neue
  Katalogfassung; die Standardvorlage bleibt kapitelgleich (die neuen
  Bilder gehören zu keinem Kapitel).
- Tests: Rahmenzahl der ausführlichen Vorlage 26, Fassung der Beispiel-
  und Standardvorlage = KatalogfassungWord, Glossarwache mit den
  Positionsbeispielen.

Co-Authored-By: Claude Opus 5.5 <noreply@anthropic.com>
Claude-Session: https://claude.ai/code/session_01WuTkTgYBbZGmc25Uq4qwuU
</commit_message>
<xml_diff>
--- a/WindowsFormsApplication1/Allgemein/Bericht/Vorlagen/Berichtsvorlage_Ausfuehrlich.docx
+++ b/WindowsFormsApplication1/Allgemein/Bericht/Vorlagen/Berichtsvorlage_Ausfuehrlich.docx
@@ -2640,6 +2640,901 @@
         <w:rPr>
           <w:noProof/>
         </w:rPr>
+        <w:t xml:space="preserve">{{#wenn hat.bild.bedarf_waerme}}</w:t>
+      </w:r>
+    </w:p>
+    <w:p>
+      <w:pPr>
+        <w:pStyle w:val="Normal"/>
+      </w:pPr>
+      <w:r>
+        <w:rPr>
+          <w:noProof/>
+        </w:rPr>
+        <w:drawing>
+          <wp:inline distT="0" distB="0" distL="0" distR="0">
+            <wp:extent cx="5940425" cy="2682772"/>
+            <wp:effectExtent l="0" t="0" r="0" b="0"/>
+            <wp:docPr id="106" name="Bildplatzhalter 106" descr="{{stand.bild.bedarf_waerme}}"/>
+            <wp:cNvGraphicFramePr>
+              <a:graphicFrameLocks xmlns:a="http://schemas.openxmlformats.org/drawingml/2006/main" noChangeAspect="1"/>
+            </wp:cNvGraphicFramePr>
+            <a:graphic xmlns:a="http://schemas.openxmlformats.org/drawingml/2006/main">
+              <a:graphicData uri="http://schemas.openxmlformats.org/drawingml/2006/picture">
+                <pic:pic xmlns:pic="http://schemas.openxmlformats.org/drawingml/2006/picture">
+                  <pic:nvPicPr>
+                    <pic:cNvPr id="0" name="bildplatzhalter.png"/>
+                    <pic:cNvPicPr/>
+                  </pic:nvPicPr>
+                  <pic:blipFill>
+                    <a:blip r:embed="rIdBildplatzhalter"/>
+                    <a:stretch>
+                      <a:fillRect/>
+                    </a:stretch>
+                  </pic:blipFill>
+                  <pic:spPr>
+                    <a:xfrm>
+                      <a:off x="0" y="0"/>
+                      <a:ext cx="5940425" cy="2682772"/>
+                    </a:xfrm>
+                    <a:prstGeom prst="rect">
+                      <a:avLst/>
+                    </a:prstGeom>
+                  </pic:spPr>
+                </pic:pic>
+              </a:graphicData>
+            </a:graphic>
+          </wp:inline>
+        </w:drawing>
+      </w:r>
+    </w:p>
+    <w:p>
+      <w:pPr>
+        <w:pStyle w:val="Beschriftung"/>
+      </w:pPr>
+      <w:r>
+        <w:t xml:space="preserve">Wärmelast im Jahresverlauf (normiert, Summe und Wärmekanäle)</w:t>
+      </w:r>
+    </w:p>
+    <w:p>
+      <w:pPr>
+        <w:pStyle w:val="Normal"/>
+      </w:pPr>
+      <w:r>
+        <w:rPr>
+          <w:noProof/>
+        </w:rPr>
+        <w:t xml:space="preserve">{{/wenn}}</w:t>
+      </w:r>
+    </w:p>
+    <w:p>
+      <w:pPr>
+        <w:pStyle w:val="Normal"/>
+      </w:pPr>
+      <w:r>
+        <w:rPr>
+          <w:noProof/>
+        </w:rPr>
+        <w:t xml:space="preserve">{{#wenn hat.bild.bedarf_strom}}</w:t>
+      </w:r>
+    </w:p>
+    <w:p>
+      <w:pPr>
+        <w:pStyle w:val="Normal"/>
+      </w:pPr>
+      <w:r>
+        <w:rPr>
+          <w:noProof/>
+        </w:rPr>
+        <w:drawing>
+          <wp:inline distT="0" distB="0" distL="0" distR="0">
+            <wp:extent cx="5940425" cy="2682772"/>
+            <wp:effectExtent l="0" t="0" r="0" b="0"/>
+            <wp:docPr id="107" name="Bildplatzhalter 107" descr="{{stand.bild.bedarf_strom}}"/>
+            <wp:cNvGraphicFramePr>
+              <a:graphicFrameLocks xmlns:a="http://schemas.openxmlformats.org/drawingml/2006/main" noChangeAspect="1"/>
+            </wp:cNvGraphicFramePr>
+            <a:graphic xmlns:a="http://schemas.openxmlformats.org/drawingml/2006/main">
+              <a:graphicData uri="http://schemas.openxmlformats.org/drawingml/2006/picture">
+                <pic:pic xmlns:pic="http://schemas.openxmlformats.org/drawingml/2006/picture">
+                  <pic:nvPicPr>
+                    <pic:cNvPr id="0" name="bildplatzhalter.png"/>
+                    <pic:cNvPicPr/>
+                  </pic:nvPicPr>
+                  <pic:blipFill>
+                    <a:blip r:embed="rIdBildplatzhalter"/>
+                    <a:stretch>
+                      <a:fillRect/>
+                    </a:stretch>
+                  </pic:blipFill>
+                  <pic:spPr>
+                    <a:xfrm>
+                      <a:off x="0" y="0"/>
+                      <a:ext cx="5940425" cy="2682772"/>
+                    </a:xfrm>
+                    <a:prstGeom prst="rect">
+                      <a:avLst/>
+                    </a:prstGeom>
+                  </pic:spPr>
+                </pic:pic>
+              </a:graphicData>
+            </a:graphic>
+          </wp:inline>
+        </w:drawing>
+      </w:r>
+    </w:p>
+    <w:p>
+      <w:pPr>
+        <w:pStyle w:val="Beschriftung"/>
+      </w:pPr>
+      <w:r>
+        <w:t xml:space="preserve">Strombedarf im Jahresverlauf (normiert)</w:t>
+      </w:r>
+    </w:p>
+    <w:p>
+      <w:pPr>
+        <w:pStyle w:val="Normal"/>
+      </w:pPr>
+      <w:r>
+        <w:rPr>
+          <w:noProof/>
+        </w:rPr>
+        <w:t xml:space="preserve">{{/wenn}}</w:t>
+      </w:r>
+    </w:p>
+    <w:p>
+      <w:pPr>
+        <w:pStyle w:val="Normal"/>
+      </w:pPr>
+      <w:r>
+        <w:rPr>
+          <w:noProof/>
+        </w:rPr>
+        <w:t xml:space="preserve">{{#wenn hat.bild.bedarf_kaelte}}</w:t>
+      </w:r>
+    </w:p>
+    <w:p>
+      <w:pPr>
+        <w:pStyle w:val="Normal"/>
+      </w:pPr>
+      <w:r>
+        <w:rPr>
+          <w:noProof/>
+        </w:rPr>
+        <w:drawing>
+          <wp:inline distT="0" distB="0" distL="0" distR="0">
+            <wp:extent cx="5940425" cy="2682772"/>
+            <wp:effectExtent l="0" t="0" r="0" b="0"/>
+            <wp:docPr id="108" name="Bildplatzhalter 108" descr="{{stand.bild.bedarf_kaelte}}"/>
+            <wp:cNvGraphicFramePr>
+              <a:graphicFrameLocks xmlns:a="http://schemas.openxmlformats.org/drawingml/2006/main" noChangeAspect="1"/>
+            </wp:cNvGraphicFramePr>
+            <a:graphic xmlns:a="http://schemas.openxmlformats.org/drawingml/2006/main">
+              <a:graphicData uri="http://schemas.openxmlformats.org/drawingml/2006/picture">
+                <pic:pic xmlns:pic="http://schemas.openxmlformats.org/drawingml/2006/picture">
+                  <pic:nvPicPr>
+                    <pic:cNvPr id="0" name="bildplatzhalter.png"/>
+                    <pic:cNvPicPr/>
+                  </pic:nvPicPr>
+                  <pic:blipFill>
+                    <a:blip r:embed="rIdBildplatzhalter"/>
+                    <a:stretch>
+                      <a:fillRect/>
+                    </a:stretch>
+                  </pic:blipFill>
+                  <pic:spPr>
+                    <a:xfrm>
+                      <a:off x="0" y="0"/>
+                      <a:ext cx="5940425" cy="2682772"/>
+                    </a:xfrm>
+                    <a:prstGeom prst="rect">
+                      <a:avLst/>
+                    </a:prstGeom>
+                  </pic:spPr>
+                </pic:pic>
+              </a:graphicData>
+            </a:graphic>
+          </wp:inline>
+        </w:drawing>
+      </w:r>
+    </w:p>
+    <w:p>
+      <w:pPr>
+        <w:pStyle w:val="Beschriftung"/>
+      </w:pPr>
+      <w:r>
+        <w:t xml:space="preserve">Kältelast im Jahresverlauf (normiert)</w:t>
+      </w:r>
+    </w:p>
+    <w:p>
+      <w:pPr>
+        <w:pStyle w:val="Normal"/>
+      </w:pPr>
+      <w:r>
+        <w:rPr>
+          <w:noProof/>
+        </w:rPr>
+        <w:t xml:space="preserve">{{/wenn}}</w:t>
+      </w:r>
+    </w:p>
+    <w:p>
+      <w:pPr>
+        <w:pStyle w:val="Normal"/>
+      </w:pPr>
+      <w:r>
+        <w:rPr>
+          <w:noProof/>
+        </w:rPr>
+        <w:t xml:space="preserve">{{#wenn hat.bild.waermepumpe}}</w:t>
+      </w:r>
+    </w:p>
+    <w:p>
+      <w:pPr>
+        <w:pStyle w:val="Normal"/>
+      </w:pPr>
+      <w:r>
+        <w:rPr>
+          <w:noProof/>
+        </w:rPr>
+        <w:drawing>
+          <wp:inline distT="0" distB="0" distL="0" distR="0">
+            <wp:extent cx="5940425" cy="2682772"/>
+            <wp:effectExtent l="0" t="0" r="0" b="0"/>
+            <wp:docPr id="109" name="Bildplatzhalter 109" descr="{{stand.bild.waermepumpe}}"/>
+            <wp:cNvGraphicFramePr>
+              <a:graphicFrameLocks xmlns:a="http://schemas.openxmlformats.org/drawingml/2006/main" noChangeAspect="1"/>
+            </wp:cNvGraphicFramePr>
+            <a:graphic xmlns:a="http://schemas.openxmlformats.org/drawingml/2006/main">
+              <a:graphicData uri="http://schemas.openxmlformats.org/drawingml/2006/picture">
+                <pic:pic xmlns:pic="http://schemas.openxmlformats.org/drawingml/2006/picture">
+                  <pic:nvPicPr>
+                    <pic:cNvPr id="0" name="bildplatzhalter.png"/>
+                    <pic:cNvPicPr/>
+                  </pic:nvPicPr>
+                  <pic:blipFill>
+                    <a:blip r:embed="rIdBildplatzhalter"/>
+                    <a:stretch>
+                      <a:fillRect/>
+                    </a:stretch>
+                  </pic:blipFill>
+                  <pic:spPr>
+                    <a:xfrm>
+                      <a:off x="0" y="0"/>
+                      <a:ext cx="5940425" cy="2682772"/>
+                    </a:xfrm>
+                    <a:prstGeom prst="rect">
+                      <a:avLst/>
+                    </a:prstGeom>
+                  </pic:spPr>
+                </pic:pic>
+              </a:graphicData>
+            </a:graphic>
+          </wp:inline>
+        </w:drawing>
+      </w:r>
+    </w:p>
+    <w:p>
+      <w:pPr>
+        <w:pStyle w:val="Beschriftung"/>
+      </w:pPr>
+      <w:r>
+        <w:t xml:space="preserve">Wärmepumpe: Wärmeproduktion und Heizstab mit Wärmebedarf</w:t>
+      </w:r>
+    </w:p>
+    <w:p>
+      <w:pPr>
+        <w:pStyle w:val="Normal"/>
+      </w:pPr>
+      <w:r>
+        <w:rPr>
+          <w:noProof/>
+        </w:rPr>
+        <w:t xml:space="preserve">{{/wenn}}</w:t>
+      </w:r>
+    </w:p>
+    <w:p>
+      <w:pPr>
+        <w:pStyle w:val="Normal"/>
+      </w:pPr>
+      <w:r>
+        <w:rPr>
+          <w:noProof/>
+        </w:rPr>
+        <w:t xml:space="preserve">{{#wenn hat.bild.waermepumpe_strom}}</w:t>
+      </w:r>
+    </w:p>
+    <w:p>
+      <w:pPr>
+        <w:pStyle w:val="Normal"/>
+      </w:pPr>
+      <w:r>
+        <w:rPr>
+          <w:noProof/>
+        </w:rPr>
+        <w:drawing>
+          <wp:inline distT="0" distB="0" distL="0" distR="0">
+            <wp:extent cx="5940425" cy="2682772"/>
+            <wp:effectExtent l="0" t="0" r="0" b="0"/>
+            <wp:docPr id="110" name="Bildplatzhalter 110" descr="{{stand.bild.waermepumpe_strom}}"/>
+            <wp:cNvGraphicFramePr>
+              <a:graphicFrameLocks xmlns:a="http://schemas.openxmlformats.org/drawingml/2006/main" noChangeAspect="1"/>
+            </wp:cNvGraphicFramePr>
+            <a:graphic xmlns:a="http://schemas.openxmlformats.org/drawingml/2006/main">
+              <a:graphicData uri="http://schemas.openxmlformats.org/drawingml/2006/picture">
+                <pic:pic xmlns:pic="http://schemas.openxmlformats.org/drawingml/2006/picture">
+                  <pic:nvPicPr>
+                    <pic:cNvPr id="0" name="bildplatzhalter.png"/>
+                    <pic:cNvPicPr/>
+                  </pic:nvPicPr>
+                  <pic:blipFill>
+                    <a:blip r:embed="rIdBildplatzhalter"/>
+                    <a:stretch>
+                      <a:fillRect/>
+                    </a:stretch>
+                  </pic:blipFill>
+                  <pic:spPr>
+                    <a:xfrm>
+                      <a:off x="0" y="0"/>
+                      <a:ext cx="5940425" cy="2682772"/>
+                    </a:xfrm>
+                    <a:prstGeom prst="rect">
+                      <a:avLst/>
+                    </a:prstGeom>
+                  </pic:spPr>
+                </pic:pic>
+              </a:graphicData>
+            </a:graphic>
+          </wp:inline>
+        </w:drawing>
+      </w:r>
+    </w:p>
+    <w:p>
+      <w:pPr>
+        <w:pStyle w:val="Beschriftung"/>
+      </w:pPr>
+      <w:r>
+        <w:t xml:space="preserve">Wärmepumpe: Stromverbrauch samt Heizstab</w:t>
+      </w:r>
+    </w:p>
+    <w:p>
+      <w:pPr>
+        <w:pStyle w:val="Normal"/>
+      </w:pPr>
+      <w:r>
+        <w:rPr>
+          <w:noProof/>
+        </w:rPr>
+        <w:t xml:space="preserve">{{/wenn}}</w:t>
+      </w:r>
+    </w:p>
+    <w:p>
+      <w:pPr>
+        <w:pStyle w:val="Normal"/>
+      </w:pPr>
+      <w:r>
+        <w:rPr>
+          <w:noProof/>
+        </w:rPr>
+        <w:t xml:space="preserve">{{#wenn hat.bild.waermepumpe_streuwolke}}</w:t>
+      </w:r>
+    </w:p>
+    <w:p>
+      <w:pPr>
+        <w:pStyle w:val="Normal"/>
+      </w:pPr>
+      <w:r>
+        <w:rPr>
+          <w:noProof/>
+        </w:rPr>
+        <w:drawing>
+          <wp:inline distT="0" distB="0" distL="0" distR="0">
+            <wp:extent cx="5940425" cy="2682772"/>
+            <wp:effectExtent l="0" t="0" r="0" b="0"/>
+            <wp:docPr id="111" name="Bildplatzhalter 111" descr="{{stand.bild.waermepumpe_streuwolke}}"/>
+            <wp:cNvGraphicFramePr>
+              <a:graphicFrameLocks xmlns:a="http://schemas.openxmlformats.org/drawingml/2006/main" noChangeAspect="1"/>
+            </wp:cNvGraphicFramePr>
+            <a:graphic xmlns:a="http://schemas.openxmlformats.org/drawingml/2006/main">
+              <a:graphicData uri="http://schemas.openxmlformats.org/drawingml/2006/picture">
+                <pic:pic xmlns:pic="http://schemas.openxmlformats.org/drawingml/2006/picture">
+                  <pic:nvPicPr>
+                    <pic:cNvPr id="0" name="bildplatzhalter.png"/>
+                    <pic:cNvPicPr/>
+                  </pic:nvPicPr>
+                  <pic:blipFill>
+                    <a:blip r:embed="rIdBildplatzhalter"/>
+                    <a:stretch>
+                      <a:fillRect/>
+                    </a:stretch>
+                  </pic:blipFill>
+                  <pic:spPr>
+                    <a:xfrm>
+                      <a:off x="0" y="0"/>
+                      <a:ext cx="5940425" cy="2682772"/>
+                    </a:xfrm>
+                    <a:prstGeom prst="rect">
+                      <a:avLst/>
+                    </a:prstGeom>
+                  </pic:spPr>
+                </pic:pic>
+              </a:graphicData>
+            </a:graphic>
+          </wp:inline>
+        </w:drawing>
+      </w:r>
+    </w:p>
+    <w:p>
+      <w:pPr>
+        <w:pStyle w:val="Beschriftung"/>
+      </w:pPr>
+      <w:r>
+        <w:t xml:space="preserve">Wärmepumpe: Leistung über der Außentemperatur</w:t>
+      </w:r>
+    </w:p>
+    <w:p>
+      <w:pPr>
+        <w:pStyle w:val="Normal"/>
+      </w:pPr>
+      <w:r>
+        <w:rPr>
+          <w:noProof/>
+        </w:rPr>
+        <w:t xml:space="preserve">{{/wenn}}</w:t>
+      </w:r>
+    </w:p>
+    <w:p>
+      <w:pPr>
+        <w:pStyle w:val="Normal"/>
+      </w:pPr>
+      <w:r>
+        <w:rPr>
+          <w:noProof/>
+        </w:rPr>
+        <w:t xml:space="preserve">{{#wenn hat.bild.heizkessel}}</w:t>
+      </w:r>
+    </w:p>
+    <w:p>
+      <w:pPr>
+        <w:pStyle w:val="Normal"/>
+      </w:pPr>
+      <w:r>
+        <w:rPr>
+          <w:noProof/>
+        </w:rPr>
+        <w:drawing>
+          <wp:inline distT="0" distB="0" distL="0" distR="0">
+            <wp:extent cx="5940425" cy="2682772"/>
+            <wp:effectExtent l="0" t="0" r="0" b="0"/>
+            <wp:docPr id="112" name="Bildplatzhalter 112" descr="{{stand.bild.heizkessel}}"/>
+            <wp:cNvGraphicFramePr>
+              <a:graphicFrameLocks xmlns:a="http://schemas.openxmlformats.org/drawingml/2006/main" noChangeAspect="1"/>
+            </wp:cNvGraphicFramePr>
+            <a:graphic xmlns:a="http://schemas.openxmlformats.org/drawingml/2006/main">
+              <a:graphicData uri="http://schemas.openxmlformats.org/drawingml/2006/picture">
+                <pic:pic xmlns:pic="http://schemas.openxmlformats.org/drawingml/2006/picture">
+                  <pic:nvPicPr>
+                    <pic:cNvPr id="0" name="bildplatzhalter.png"/>
+                    <pic:cNvPicPr/>
+                  </pic:nvPicPr>
+                  <pic:blipFill>
+                    <a:blip r:embed="rIdBildplatzhalter"/>
+                    <a:stretch>
+                      <a:fillRect/>
+                    </a:stretch>
+                  </pic:blipFill>
+                  <pic:spPr>
+                    <a:xfrm>
+                      <a:off x="0" y="0"/>
+                      <a:ext cx="5940425" cy="2682772"/>
+                    </a:xfrm>
+                    <a:prstGeom prst="rect">
+                      <a:avLst/>
+                    </a:prstGeom>
+                  </pic:spPr>
+                </pic:pic>
+              </a:graphicData>
+            </a:graphic>
+          </wp:inline>
+        </w:drawing>
+      </w:r>
+    </w:p>
+    <w:p>
+      <w:pPr>
+        <w:pStyle w:val="Beschriftung"/>
+      </w:pPr>
+      <w:r>
+        <w:t xml:space="preserve">Heizkessel: Wärmeproduktion, Restwärme und Wärmebedarf</w:t>
+      </w:r>
+    </w:p>
+    <w:p>
+      <w:pPr>
+        <w:pStyle w:val="Normal"/>
+      </w:pPr>
+      <w:r>
+        <w:rPr>
+          <w:noProof/>
+        </w:rPr>
+        <w:t xml:space="preserve">{{/wenn}}</w:t>
+      </w:r>
+    </w:p>
+    <w:p>
+      <w:pPr>
+        <w:pStyle w:val="Normal"/>
+      </w:pPr>
+      <w:r>
+        <w:rPr>
+          <w:noProof/>
+        </w:rPr>
+        <w:t xml:space="preserve">{{#wenn hat.bild.solarthermie}}</w:t>
+      </w:r>
+    </w:p>
+    <w:p>
+      <w:pPr>
+        <w:pStyle w:val="Normal"/>
+      </w:pPr>
+      <w:r>
+        <w:rPr>
+          <w:noProof/>
+        </w:rPr>
+        <w:drawing>
+          <wp:inline distT="0" distB="0" distL="0" distR="0">
+            <wp:extent cx="5940425" cy="2682772"/>
+            <wp:effectExtent l="0" t="0" r="0" b="0"/>
+            <wp:docPr id="113" name="Bildplatzhalter 113" descr="{{stand.bild.solarthermie}}"/>
+            <wp:cNvGraphicFramePr>
+              <a:graphicFrameLocks xmlns:a="http://schemas.openxmlformats.org/drawingml/2006/main" noChangeAspect="1"/>
+            </wp:cNvGraphicFramePr>
+            <a:graphic xmlns:a="http://schemas.openxmlformats.org/drawingml/2006/main">
+              <a:graphicData uri="http://schemas.openxmlformats.org/drawingml/2006/picture">
+                <pic:pic xmlns:pic="http://schemas.openxmlformats.org/drawingml/2006/picture">
+                  <pic:nvPicPr>
+                    <pic:cNvPr id="0" name="bildplatzhalter.png"/>
+                    <pic:cNvPicPr/>
+                  </pic:nvPicPr>
+                  <pic:blipFill>
+                    <a:blip r:embed="rIdBildplatzhalter"/>
+                    <a:stretch>
+                      <a:fillRect/>
+                    </a:stretch>
+                  </pic:blipFill>
+                  <pic:spPr>
+                    <a:xfrm>
+                      <a:off x="0" y="0"/>
+                      <a:ext cx="5940425" cy="2682772"/>
+                    </a:xfrm>
+                    <a:prstGeom prst="rect">
+                      <a:avLst/>
+                    </a:prstGeom>
+                  </pic:spPr>
+                </pic:pic>
+              </a:graphicData>
+            </a:graphic>
+          </wp:inline>
+        </w:drawing>
+      </w:r>
+    </w:p>
+    <w:p>
+      <w:pPr>
+        <w:pStyle w:val="Beschriftung"/>
+      </w:pPr>
+      <w:r>
+        <w:t xml:space="preserve">Solarthermie: Wärmeproduktion und Wärmebedarf</w:t>
+      </w:r>
+    </w:p>
+    <w:p>
+      <w:pPr>
+        <w:pStyle w:val="Normal"/>
+      </w:pPr>
+      <w:r>
+        <w:rPr>
+          <w:noProof/>
+        </w:rPr>
+        <w:t xml:space="preserve">{{/wenn}}</w:t>
+      </w:r>
+    </w:p>
+    <w:p>
+      <w:pPr>
+        <w:pStyle w:val="Normal"/>
+      </w:pPr>
+      <w:r>
+        <w:rPr>
+          <w:noProof/>
+        </w:rPr>
+        <w:t xml:space="preserve">{{#wenn hat.bild.bhkw}}</w:t>
+      </w:r>
+    </w:p>
+    <w:p>
+      <w:pPr>
+        <w:pStyle w:val="Normal"/>
+      </w:pPr>
+      <w:r>
+        <w:rPr>
+          <w:noProof/>
+        </w:rPr>
+        <w:drawing>
+          <wp:inline distT="0" distB="0" distL="0" distR="0">
+            <wp:extent cx="5940425" cy="2682772"/>
+            <wp:effectExtent l="0" t="0" r="0" b="0"/>
+            <wp:docPr id="114" name="Bildplatzhalter 114" descr="{{stand.bild.bhkw}}"/>
+            <wp:cNvGraphicFramePr>
+              <a:graphicFrameLocks xmlns:a="http://schemas.openxmlformats.org/drawingml/2006/main" noChangeAspect="1"/>
+            </wp:cNvGraphicFramePr>
+            <a:graphic xmlns:a="http://schemas.openxmlformats.org/drawingml/2006/main">
+              <a:graphicData uri="http://schemas.openxmlformats.org/drawingml/2006/picture">
+                <pic:pic xmlns:pic="http://schemas.openxmlformats.org/drawingml/2006/picture">
+                  <pic:nvPicPr>
+                    <pic:cNvPr id="0" name="bildplatzhalter.png"/>
+                    <pic:cNvPicPr/>
+                  </pic:nvPicPr>
+                  <pic:blipFill>
+                    <a:blip r:embed="rIdBildplatzhalter"/>
+                    <a:stretch>
+                      <a:fillRect/>
+                    </a:stretch>
+                  </pic:blipFill>
+                  <pic:spPr>
+                    <a:xfrm>
+                      <a:off x="0" y="0"/>
+                      <a:ext cx="5940425" cy="2682772"/>
+                    </a:xfrm>
+                    <a:prstGeom prst="rect">
+                      <a:avLst/>
+                    </a:prstGeom>
+                  </pic:spPr>
+                </pic:pic>
+              </a:graphicData>
+            </a:graphic>
+          </wp:inline>
+        </w:drawing>
+      </w:r>
+    </w:p>
+    <w:p>
+      <w:pPr>
+        <w:pStyle w:val="Beschriftung"/>
+      </w:pPr>
+      <w:r>
+        <w:t xml:space="preserve">BHKW: Wärmeproduktion, Restwärme und Wärmebedarf</w:t>
+      </w:r>
+    </w:p>
+    <w:p>
+      <w:pPr>
+        <w:pStyle w:val="Normal"/>
+      </w:pPr>
+      <w:r>
+        <w:rPr>
+          <w:noProof/>
+        </w:rPr>
+        <w:t xml:space="preserve">{{/wenn}}</w:t>
+      </w:r>
+    </w:p>
+    <w:p>
+      <w:pPr>
+        <w:pStyle w:val="Normal"/>
+      </w:pPr>
+      <w:r>
+        <w:rPr>
+          <w:noProof/>
+        </w:rPr>
+        <w:t xml:space="preserve">{{#wenn hat.bild.photovoltaik}}</w:t>
+      </w:r>
+    </w:p>
+    <w:p>
+      <w:pPr>
+        <w:pStyle w:val="Normal"/>
+      </w:pPr>
+      <w:r>
+        <w:rPr>
+          <w:noProof/>
+        </w:rPr>
+        <w:drawing>
+          <wp:inline distT="0" distB="0" distL="0" distR="0">
+            <wp:extent cx="5940425" cy="2682772"/>
+            <wp:effectExtent l="0" t="0" r="0" b="0"/>
+            <wp:docPr id="115" name="Bildplatzhalter 115" descr="{{stand.bild.photovoltaik}}"/>
+            <wp:cNvGraphicFramePr>
+              <a:graphicFrameLocks xmlns:a="http://schemas.openxmlformats.org/drawingml/2006/main" noChangeAspect="1"/>
+            </wp:cNvGraphicFramePr>
+            <a:graphic xmlns:a="http://schemas.openxmlformats.org/drawingml/2006/main">
+              <a:graphicData uri="http://schemas.openxmlformats.org/drawingml/2006/picture">
+                <pic:pic xmlns:pic="http://schemas.openxmlformats.org/drawingml/2006/picture">
+                  <pic:nvPicPr>
+                    <pic:cNvPr id="0" name="bildplatzhalter.png"/>
+                    <pic:cNvPicPr/>
+                  </pic:nvPicPr>
+                  <pic:blipFill>
+                    <a:blip r:embed="rIdBildplatzhalter"/>
+                    <a:stretch>
+                      <a:fillRect/>
+                    </a:stretch>
+                  </pic:blipFill>
+                  <pic:spPr>
+                    <a:xfrm>
+                      <a:off x="0" y="0"/>
+                      <a:ext cx="5940425" cy="2682772"/>
+                    </a:xfrm>
+                    <a:prstGeom prst="rect">
+                      <a:avLst/>
+                    </a:prstGeom>
+                  </pic:spPr>
+                </pic:pic>
+              </a:graphicData>
+            </a:graphic>
+          </wp:inline>
+        </w:drawing>
+      </w:r>
+    </w:p>
+    <w:p>
+      <w:pPr>
+        <w:pStyle w:val="Beschriftung"/>
+      </w:pPr>
+      <w:r>
+        <w:t xml:space="preserve">Photovoltaik: Erzeugung, Überschuss und Strombedarf</w:t>
+      </w:r>
+    </w:p>
+    <w:p>
+      <w:pPr>
+        <w:pStyle w:val="Normal"/>
+      </w:pPr>
+      <w:r>
+        <w:rPr>
+          <w:noProof/>
+        </w:rPr>
+        <w:t xml:space="preserve">{{/wenn}}</w:t>
+      </w:r>
+    </w:p>
+    <w:p>
+      <w:pPr>
+        <w:pStyle w:val="Normal"/>
+      </w:pPr>
+      <w:r>
+        <w:rPr>
+          <w:noProof/>
+        </w:rPr>
+        <w:t xml:space="preserve">{{#wenn stand.hat_speicherlauf}}</w:t>
+      </w:r>
+    </w:p>
+    <w:p>
+      <w:pPr>
+        <w:pStyle w:val="Normal"/>
+      </w:pPr>
+      <w:r>
+        <w:t xml:space="preserve">Stromspeicher: </w:t>
+      </w:r>
+      <w:r>
+        <w:rPr>
+          <w:noProof/>
+        </w:rPr>
+        <w:t xml:space="preserve">{{stand.speicher.betriebsart}}</w:t>
+      </w:r>
+      <w:r>
+        <w:t xml:space="preserve">, </w:t>
+      </w:r>
+      <w:r>
+        <w:rPr>
+          <w:noProof/>
+        </w:rPr>
+        <w:t xml:space="preserve">{{stand.speicher.berechnungsart}}</w:t>
+      </w:r>
+    </w:p>
+    <w:p>
+      <w:pPr>
+        <w:pStyle w:val="Normal"/>
+      </w:pPr>
+      <w:r>
+        <w:t xml:space="preserve">Ertrag </w:t>
+      </w:r>
+      <w:r>
+        <w:rPr>
+          <w:noProof/>
+        </w:rPr>
+        <w:t xml:space="preserve">{{stand.speicher.ertrag}}</w:t>
+      </w:r>
+      <w:r>
+        <w:t xml:space="preserve">, Überschuss </w:t>
+      </w:r>
+      <w:r>
+        <w:rPr>
+          <w:noProof/>
+        </w:rPr>
+        <w:t xml:space="preserve">{{stand.speicher.ueberschuss}}</w:t>
+      </w:r>
+      <w:r>
+        <w:t xml:space="preserve">, Amortisation </w:t>
+      </w:r>
+      <w:r>
+        <w:rPr>
+          <w:noProof/>
+        </w:rPr>
+        <w:t xml:space="preserve">{{stand.speicher.amortisation}}</w:t>
+      </w:r>
+    </w:p>
+    <w:p>
+      <w:pPr>
+        <w:pStyle w:val="Normal"/>
+      </w:pPr>
+      <w:r>
+        <w:t xml:space="preserve">Vollzyklen </w:t>
+      </w:r>
+      <w:r>
+        <w:rPr>
+          <w:noProof/>
+        </w:rPr>
+        <w:t xml:space="preserve">{{stand.speicher.vollzyklen}}</w:t>
+      </w:r>
+      <w:r>
+        <w:t xml:space="preserve">, Eigenverbrauch </w:t>
+      </w:r>
+      <w:r>
+        <w:rPr>
+          <w:noProof/>
+        </w:rPr>
+        <w:t xml:space="preserve">{{stand.speicher.eigenverbrauch}}</w:t>
+      </w:r>
+      <w:r>
+        <w:t xml:space="preserve">, Autarkie </w:t>
+      </w:r>
+      <w:r>
+        <w:rPr>
+          <w:noProof/>
+        </w:rPr>
+        <w:t xml:space="preserve">{{stand.speicher.autarkie}}</w:t>
+      </w:r>
+    </w:p>
+    <w:p>
+      <w:pPr>
+        <w:pStyle w:val="Normal"/>
+      </w:pPr>
+      <w:r>
+        <w:rPr>
+          <w:noProof/>
+        </w:rPr>
+        <w:t xml:space="preserve">{{/wenn}}</w:t>
+      </w:r>
+    </w:p>
+    <w:p>
+      <w:pPr>
+        <w:pStyle w:val="Normal"/>
+      </w:pPr>
+      <w:r>
+        <w:rPr>
+          <w:noProof/>
+        </w:rPr>
+        <w:t xml:space="preserve">{{#wenn hat.bild.solarthermie}}</w:t>
+      </w:r>
+    </w:p>
+    <w:p>
+      <w:pPr>
+        <w:pStyle w:val="Normal"/>
+      </w:pPr>
+      <w:r>
+        <w:t xml:space="preserve">Solare Deckung des Wärmebedarfs: </w:t>
+      </w:r>
+      <w:r>
+        <w:rPr>
+          <w:noProof/>
+        </w:rPr>
+        <w:t xml:space="preserve">{{stand.solarthermie.deckung}}</w:t>
+      </w:r>
+    </w:p>
+    <w:p>
+      <w:pPr>
+        <w:pStyle w:val="Normal"/>
+      </w:pPr>
+      <w:r>
+        <w:rPr>
+          <w:noProof/>
+        </w:rPr>
+        <w:t xml:space="preserve">{{/wenn}}</w:t>
+      </w:r>
+    </w:p>
+    <w:p>
+      <w:pPr>
+        <w:pStyle w:val="Normal"/>
+      </w:pPr>
+      <w:r>
+        <w:rPr>
+          <w:noProof/>
+        </w:rPr>
         <w:t xml:space="preserve">{{/je}}</w:t>
       </w:r>
     </w:p>
@@ -3271,7 +4166,7 @@
           <wp:inline distT="0" distB="0" distL="0" distR="0">
             <wp:extent cx="5940425" cy="3564255"/>
             <wp:effectExtent l="0" t="0" r="0" b="0"/>
-            <wp:docPr id="106" name="Bildplatzhalter 106" descr="{{bild.vergleich.balken.energie.brennstoff}}"/>
+            <wp:docPr id="116" name="Bildplatzhalter 116" descr="{{bild.vergleich.balken.energie.brennstoff}}"/>
             <wp:cNvGraphicFramePr>
               <a:graphicFrameLocks xmlns:a="http://schemas.openxmlformats.org/drawingml/2006/main" noChangeAspect="1"/>
             </wp:cNvGraphicFramePr>
@@ -3352,7 +4247,7 @@
           <wp:inline distT="0" distB="0" distL="0" distR="0">
             <wp:extent cx="5940425" cy="3564255"/>
             <wp:effectExtent l="0" t="0" r="0" b="0"/>
-            <wp:docPr id="107" name="Bildplatzhalter 107" descr="{{bild.vergleich.balken.energie.netzbezug}}"/>
+            <wp:docPr id="117" name="Bildplatzhalter 117" descr="{{bild.vergleich.balken.energie.netzbezug}}"/>
             <wp:cNvGraphicFramePr>
               <a:graphicFrameLocks xmlns:a="http://schemas.openxmlformats.org/drawingml/2006/main" noChangeAspect="1"/>
             </wp:cNvGraphicFramePr>
@@ -3433,7 +4328,7 @@
           <wp:inline distT="0" distB="0" distL="0" distR="0">
             <wp:extent cx="5940425" cy="3564255"/>
             <wp:effectExtent l="0" t="0" r="0" b="0"/>
-            <wp:docPr id="108" name="Bildplatzhalter 108" descr="{{bild.vergleich.balken.energie.waermerest}}"/>
+            <wp:docPr id="118" name="Bildplatzhalter 118" descr="{{bild.vergleich.balken.energie.waermerest}}"/>
             <wp:cNvGraphicFramePr>
               <a:graphicFrameLocks xmlns:a="http://schemas.openxmlformats.org/drawingml/2006/main" noChangeAspect="1"/>
             </wp:cNvGraphicFramePr>
@@ -3514,7 +4409,7 @@
           <wp:inline distT="0" distB="0" distL="0" distR="0">
             <wp:extent cx="5940425" cy="3564255"/>
             <wp:effectExtent l="0" t="0" r="0" b="0"/>
-            <wp:docPr id="109" name="Bildplatzhalter 109" descr="{{bild.vergleich.balken.eff.jaz}}"/>
+            <wp:docPr id="119" name="Bildplatzhalter 119" descr="{{bild.vergleich.balken.eff.jaz}}"/>
             <wp:cNvGraphicFramePr>
               <a:graphicFrameLocks xmlns:a="http://schemas.openxmlformats.org/drawingml/2006/main" noChangeAspect="1"/>
             </wp:cNvGraphicFramePr>
@@ -3667,7 +4562,7 @@
                 <wp:inline distT="0" distB="0" distL="0" distR="0">
                   <wp:extent cx="2808000" cy="1752000"/>
                   <wp:effectExtent l="0" t="0" r="0" b="0"/>
-                  <wp:docPr id="110" name="Bildplatzhalter 110" descr="{{stand.bild.deckung_waerme}}"/>
+                  <wp:docPr id="120" name="Bildplatzhalter 120" descr="{{stand.bild.deckung_waerme}}"/>
                   <wp:cNvGraphicFramePr>
                     <a:graphicFrameLocks xmlns:a="http://schemas.openxmlformats.org/drawingml/2006/main" noChangeAspect="1"/>
                   </wp:cNvGraphicFramePr>
@@ -3715,7 +4610,7 @@
                 <wp:inline distT="0" distB="0" distL="0" distR="0">
                   <wp:extent cx="2808000" cy="1752000"/>
                   <wp:effectExtent l="0" t="0" r="0" b="0"/>
-                  <wp:docPr id="111" name="Bildplatzhalter 111" descr="{{stand.bild.deckung_strom}}"/>
+                  <wp:docPr id="121" name="Bildplatzhalter 121" descr="{{stand.bild.deckung_strom}}"/>
                   <wp:cNvGraphicFramePr>
                     <a:graphicFrameLocks xmlns:a="http://schemas.openxmlformats.org/drawingml/2006/main" noChangeAspect="1"/>
                   </wp:cNvGraphicFramePr>
@@ -4515,7 +5410,7 @@
           <wp:inline distT="0" distB="0" distL="0" distR="0">
             <wp:extent cx="5940425" cy="3564255"/>
             <wp:effectExtent l="0" t="0" r="0" b="0"/>
-            <wp:docPr id="112" name="Bildplatzhalter 112" descr="{{bild.wirtschaft.kapitalwert_szenarien}}"/>
+            <wp:docPr id="122" name="Bildplatzhalter 122" descr="{{bild.wirtschaft.kapitalwert_szenarien}}"/>
             <wp:cNvGraphicFramePr>
               <a:graphicFrameLocks xmlns:a="http://schemas.openxmlformats.org/drawingml/2006/main" noChangeAspect="1"/>
             </wp:cNvGraphicFramePr>
@@ -4582,7 +5477,7 @@
           <wp:inline distT="0" distB="0" distL="0" distR="0">
             <wp:extent cx="5940425" cy="2970212"/>
             <wp:effectExtent l="0" t="0" r="0" b="0"/>
-            <wp:docPr id="113" name="Bildplatzhalter 113" descr="{{bild.wirtschaft.barwerte_kumuliert}}"/>
+            <wp:docPr id="123" name="Bildplatzhalter 123" descr="{{bild.wirtschaft.barwerte_kumuliert}}"/>
             <wp:cNvGraphicFramePr>
               <a:graphicFrameLocks xmlns:a="http://schemas.openxmlformats.org/drawingml/2006/main" noChangeAspect="1"/>
             </wp:cNvGraphicFramePr>
@@ -4657,7 +5552,7 @@
           <wp:inline distT="0" distB="0" distL="0" distR="0">
             <wp:extent cx="5940425" cy="3564255"/>
             <wp:effectExtent l="0" t="0" r="0" b="0"/>
-            <wp:docPr id="114" name="Bildplatzhalter 114" descr="{{bild.wirtschaft.bruecke}}"/>
+            <wp:docPr id="124" name="Bildplatzhalter 124" descr="{{bild.wirtschaft.bruecke}}"/>
             <wp:cNvGraphicFramePr>
               <a:graphicFrameLocks xmlns:a="http://schemas.openxmlformats.org/drawingml/2006/main" noChangeAspect="1"/>
             </wp:cNvGraphicFramePr>
@@ -4790,7 +5685,7 @@
           <wp:inline distT="0" distB="0" distL="0" distR="0">
             <wp:extent cx="5940425" cy="3564255"/>
             <wp:effectExtent l="0" t="0" r="0" b="0"/>
-            <wp:docPr id="115" name="Bildplatzhalter 115" descr="{{stand.bild.zahlungsstrom}}"/>
+            <wp:docPr id="125" name="Bildplatzhalter 125" descr="{{stand.bild.zahlungsstrom}}"/>
             <wp:cNvGraphicFramePr>
               <a:graphicFrameLocks xmlns:a="http://schemas.openxmlformats.org/drawingml/2006/main" noChangeAspect="1"/>
             </wp:cNvGraphicFramePr>
@@ -4946,7 +5841,7 @@
           <wp:inline distT="0" distB="0" distL="0" distR="0">
             <wp:extent cx="5940425" cy="2970212"/>
             <wp:effectExtent l="0" t="0" r="0" b="0"/>
-            <wp:docPr id="116" name="Bildplatzhalter 116" descr="{{bild.wirtschaft.spanne}}"/>
+            <wp:docPr id="126" name="Bildplatzhalter 126" descr="{{bild.wirtschaft.spanne}}"/>
             <wp:cNvGraphicFramePr>
               <a:graphicFrameLocks xmlns:a="http://schemas.openxmlformats.org/drawingml/2006/main" noChangeAspect="1"/>
             </wp:cNvGraphicFramePr>

</xml_diff>

<commit_message>
P4c (6): Berichtsplatzhalter tabelle.pufferauslegung (Katalog v12)
Vorlagenfeld tabelle.pufferauslegung (Kontext Stamm, Kapitel Projekt,
Fassung 12) samt Schalter hat.tabelle.pufferauslegung und Katalogtext
VF_TABELLE__PUFFERAUSLEGUNG de/en: dieselben Eigenschaftspaare wie der
Baustein (eine Quelle, PufferauslegungPaare), je Auslegung eine
Gruppenzeile. WordKontext.Vorlagenfelder: steht der Platzhalter in der
Vorlage, schreibt der Baustein am Standardort nichts. Katalogfassung
11 -> 12, Messlatte v12, alle mitgelieferten Vorlagen mit
Werkzeuge/Berichtsvorlage (alle) neu gebaut, ausführliche Vorlage mit
der Tafel im Kapitel Projekt.

Co-Authored-By: Claude Opus 5.5 <noreply@anthropic.com>
Claude-Session: https://claude.ai/code/session_01BPMpCujk3rWKNoAC783jJT
</commit_message>
<xml_diff>
--- a/WindowsFormsApplication1/Allgemein/Bericht/Vorlagen/Berichtsvorlage_Ausfuehrlich.docx
+++ b/WindowsFormsApplication1/Allgemein/Bericht/Vorlagen/Berichtsvorlage_Ausfuehrlich.docx
@@ -1683,6 +1683,47 @@
           <w:noProof/>
         </w:rPr>
         <w:t xml:space="preserve">{{tabelle.gebaeude.ergebnis}}</w:t>
+      </w:r>
+    </w:p>
+    <w:p>
+      <w:pPr>
+        <w:pStyle w:val="Normal"/>
+      </w:pPr>
+      <w:r>
+        <w:rPr>
+          <w:noProof/>
+        </w:rPr>
+        <w:t xml:space="preserve">{{/wenn}}</w:t>
+      </w:r>
+    </w:p>
+    <w:p>
+      <w:pPr>
+        <w:pStyle w:val="Normal"/>
+      </w:pPr>
+      <w:r>
+        <w:rPr>
+          <w:noProof/>
+        </w:rPr>
+        <w:t xml:space="preserve">{{#wenn hat.tabelle.pufferauslegung}}</w:t>
+      </w:r>
+    </w:p>
+    <w:p>
+      <w:pPr>
+        <w:pStyle w:val="Heading2"/>
+      </w:pPr>
+      <w:r>
+        <w:t xml:space="preserve">Pufferspeicher-Auslegung</w:t>
+      </w:r>
+    </w:p>
+    <w:p>
+      <w:pPr>
+        <w:pStyle w:val="Normal"/>
+      </w:pPr>
+      <w:r>
+        <w:rPr>
+          <w:noProof/>
+        </w:rPr>
+        <w:t xml:space="preserve">{{tabelle.pufferauslegung}}</w:t>
       </w:r>
     </w:p>
     <w:p>

</xml_diff>

<commit_message>
Nachzug Gate 722: Kältespeicher-Tafel in der ausführlichen Vorlage, Zielversion 185
Die ausführliche Berichtsvorlage führt die Tafel tabelle.kaeltespeicher (bedingt mit hat.tabelle.kaeltespeicher), beide Sprachen mit dem Werkzeug neu erzeugt; KaeltemaschineAbrechnungTests prüft die Zielversion als ≥ 184 statt = 184.

Co-Authored-By: Claude Fable 5.1 <noreply@anthropic.com>
Claude-Session: https://claude.ai/code/session_01V9wpg3mpxG7aK2r3MzJ8GQ
</commit_message>
<xml_diff>
--- a/WindowsFormsApplication1/Allgemein/Bericht/Vorlagen/Berichtsvorlage_Ausfuehrlich.docx
+++ b/WindowsFormsApplication1/Allgemein/Bericht/Vorlagen/Berichtsvorlage_Ausfuehrlich.docx
@@ -1724,6 +1724,47 @@
           <w:noProof/>
         </w:rPr>
         <w:t xml:space="preserve">{{tabelle.pufferauslegung}}</w:t>
+      </w:r>
+    </w:p>
+    <w:p>
+      <w:pPr>
+        <w:pStyle w:val="Normal"/>
+      </w:pPr>
+      <w:r>
+        <w:rPr>
+          <w:noProof/>
+        </w:rPr>
+        <w:t xml:space="preserve">{{/wenn}}</w:t>
+      </w:r>
+    </w:p>
+    <w:p>
+      <w:pPr>
+        <w:pStyle w:val="Normal"/>
+      </w:pPr>
+      <w:r>
+        <w:rPr>
+          <w:noProof/>
+        </w:rPr>
+        <w:t xml:space="preserve">{{#wenn hat.tabelle.kaeltespeicher}}</w:t>
+      </w:r>
+    </w:p>
+    <w:p>
+      <w:pPr>
+        <w:pStyle w:val="Heading2"/>
+      </w:pPr>
+      <w:r>
+        <w:t xml:space="preserve">Kältespeicher</w:t>
+      </w:r>
+    </w:p>
+    <w:p>
+      <w:pPr>
+        <w:pStyle w:val="Normal"/>
+      </w:pPr>
+      <w:r>
+        <w:rPr>
+          <w:noProof/>
+        </w:rPr>
+        <w:t xml:space="preserve">{{tabelle.kaeltespeicher}}</w:t>
       </w:r>
     </w:p>
     <w:p>

</xml_diff>

<commit_message>
KP3-O3b-4: Blocktiefe der Vorlage, Fassung über den Schlüssel, Wachen
Der Vorlagenprüfer erlaubt zwei Blockebenen; der Gebäudeblock der
ausführlichen Vorlage hatte vier (VF_PRUEF_BLOCK_TIEFE, rot in
AusfuehrlichRundlauf-, Berichtssprache- und Mustertests). Jetzt
Überschrift und je Stand die Tafel je unter hat.tabelle.vergleich.gebaeude
(der Gruppenschalter gilt auch in {{#je stand}}); der Standardbericht
folgt derselben Regel (wie die Erzeugerliste auch ohne Variante).
SeitDerKennzahl(string) liest Kennzahl.Seit mit (Standwerte-Tests über
den Schlüssel); die Kesseltafelwache nimmt die beiden v16-Schalter aus.
Vorlagen neu erzeugt.

Co-Authored-By: Claude Opus 5.5 <noreply@anthropic.com>
Claude-Session: https://claude.ai/code/session_01H9uGe7RdCJxbSxTUPLM6Ta
</commit_message>
<xml_diff>
--- a/WindowsFormsApplication1/Allgemein/Bericht/Vorlagen/Berichtsvorlage_Ausfuehrlich.docx
+++ b/WindowsFormsApplication1/Allgemein/Bericht/Vorlagen/Berichtsvorlage_Ausfuehrlich.docx
@@ -5172,17 +5172,6 @@
         <w:rPr>
           <w:noProof/>
         </w:rPr>
-        <w:t xml:space="preserve">{{#wenn hat.varianten}}</w:t>
-      </w:r>
-    </w:p>
-    <w:p>
-      <w:pPr>
-        <w:pStyle w:val="Normal"/>
-      </w:pPr>
-      <w:r>
-        <w:rPr>
-          <w:noProof/>
-        </w:rPr>
         <w:t xml:space="preserve">{{#wenn hat.tabelle.vergleich.gebaeude}}</w:t>
       </w:r>
     </w:p>
@@ -5210,6 +5199,17 @@
         <w:rPr>
           <w:noProof/>
         </w:rPr>
+        <w:t xml:space="preserve">{{/wenn}}</w:t>
+      </w:r>
+    </w:p>
+    <w:p>
+      <w:pPr>
+        <w:pStyle w:val="Normal"/>
+      </w:pPr>
+      <w:r>
+        <w:rPr>
+          <w:noProof/>
+        </w:rPr>
         <w:t xml:space="preserve">{{#je stand}}</w:t>
       </w:r>
     </w:p>
@@ -5221,7 +5221,7 @@
         <w:rPr>
           <w:noProof/>
         </w:rPr>
-        <w:t xml:space="preserve">{{#wenn hat.tabelle.gebaeude}}</w:t>
+        <w:t xml:space="preserve">{{#wenn hat.tabelle.vergleich.gebaeude}}</w:t>
       </w:r>
     </w:p>
     <w:p>
@@ -5275,28 +5275,6 @@
           <w:noProof/>
         </w:rPr>
         <w:t xml:space="preserve">{{/je}}</w:t>
-      </w:r>
-    </w:p>
-    <w:p>
-      <w:pPr>
-        <w:pStyle w:val="Normal"/>
-      </w:pPr>
-      <w:r>
-        <w:rPr>
-          <w:noProof/>
-        </w:rPr>
-        <w:t xml:space="preserve">{{/wenn}}</w:t>
-      </w:r>
-    </w:p>
-    <w:p>
-      <w:pPr>
-        <w:pStyle w:val="Normal"/>
-      </w:pPr>
-      <w:r>
-        <w:rPr>
-          <w:noProof/>
-        </w:rPr>
-        <w:t xml:space="preserve">{{/wenn}}</w:t>
       </w:r>
     </w:p>
     <w:p>

</xml_diff>

<commit_message>
KB-7e: Vorlagen mit Kenndatentafel der Kältemaschine neu erzeugt
Werkzeuge/Berichtsvorlage führt die Kältemaschine als Gewerk der
ausführlichen Vorlage; alle zehn Vorlagen neu, Validator 0 Fehler,
zweiter Lauf byte-gleich.

Co-Authored-By: Claude Opus 5.5 <noreply@anthropic.com>
Claude-Session: https://claude.ai/code/session_01LxWpn8bgrFYtFBXppoeoCL
</commit_message>
<xml_diff>
--- a/WindowsFormsApplication1/Allgemein/Bericht/Vorlagen/Berichtsvorlage_Ausfuehrlich.docx
+++ b/WindowsFormsApplication1/Allgemein/Bericht/Vorlagen/Berichtsvorlage_Ausfuehrlich.docx
@@ -2208,6 +2208,47 @@
           <w:noProof/>
         </w:rPr>
         <w:t xml:space="preserve">{{tabelle.komponenten.kenndaten.stromspeicher}}</w:t>
+      </w:r>
+    </w:p>
+    <w:p>
+      <w:pPr>
+        <w:pStyle w:val="Normal"/>
+      </w:pPr>
+      <w:r>
+        <w:rPr>
+          <w:noProof/>
+        </w:rPr>
+        <w:t xml:space="preserve">{{/wenn}}</w:t>
+      </w:r>
+    </w:p>
+    <w:p>
+      <w:pPr>
+        <w:pStyle w:val="Normal"/>
+      </w:pPr>
+      <w:r>
+        <w:rPr>
+          <w:noProof/>
+        </w:rPr>
+        <w:t xml:space="preserve">{{#wenn hat.tabelle.komponenten.kenndaten.kaeltemaschine}}</w:t>
+      </w:r>
+    </w:p>
+    <w:p>
+      <w:pPr>
+        <w:pStyle w:val="Heading2"/>
+      </w:pPr>
+      <w:r>
+        <w:t xml:space="preserve">Kältemaschine</w:t>
+      </w:r>
+    </w:p>
+    <w:p>
+      <w:pPr>
+        <w:pStyle w:val="Normal"/>
+      </w:pPr>
+      <w:r>
+        <w:rPr>
+          <w:noProof/>
+        </w:rPr>
+        <w:t xml:space="preserve">{{tabelle.komponenten.kenndaten.kaeltemaschine}}</w:t>
       </w:r>
     </w:p>
     <w:p>

</xml_diff>